<commit_message>
docs: Cap nhat tron bo bao cao tien do Tuan 1, 2, 3, 4 chuan format LHU kem chu ky 3 nguoi
</commit_message>
<xml_diff>
--- a/Docs/BAO_CAO_TIEN_DO_TUAN_3.docx
+++ b/Docs/BAO_CAO_TIEN_DO_TUAN_3.docx
@@ -11,12 +11,41 @@
         <w:rPr>
           <w:rFonts w:ascii="Times New Roman" w:hAnsi="Times New Roman"/>
           <w:b/>
-          <w:color w:val="505050"/>
-          <w:sz w:val="21"/>
+          <w:sz w:val="22"/>
         </w:rPr>
         <w:t>TRƯỜNG ĐẠI HỌC LẠC HỒNG</w:t>
         <w:br/>
-        <w:t>KHOA CÔNG NGHỆ THÔNG TIN - HỌC PHẦN PHÁT TRIỂN ỨNG DỤNG</w:t>
+        <w:t>KHOA CÔNG NGHỆ THÔNG TIN</w:t>
+      </w:r>
+    </w:p>
+    <w:p>
+      <w:pPr>
+        <w:spacing w:before="120" w:after="40"/>
+        <w:jc w:val="center"/>
+      </w:pPr>
+      <w:r>
+        <w:rPr>
+          <w:rFonts w:ascii="Times New Roman" w:hAnsi="Times New Roman"/>
+          <w:b/>
+          <w:sz w:val="28"/>
+        </w:rPr>
+        <w:t>BÁO CÁO TIẾN ĐỘ THỰC HIỆN ĐỀ TÀI (TUẦN 3)</w:t>
+      </w:r>
+    </w:p>
+    <w:p>
+      <w:pPr>
+        <w:spacing w:after="40"/>
+        <w:jc w:val="center"/>
+      </w:pPr>
+      <w:r>
+        <w:rPr>
+          <w:rFonts w:ascii="Times New Roman" w:hAnsi="Times New Roman"/>
+          <w:i/>
+          <w:sz w:val="22"/>
+        </w:rPr>
+        <w:t>Học phần: Phát triển ứng dụng</w:t>
+        <w:br/>
+        <w:t>Thời gian: 07/09/2026 – 20/09/2026</w:t>
       </w:r>
     </w:p>
     <w:p>
@@ -27,66 +56,49 @@
       <w:r>
         <w:rPr>
           <w:rFonts w:ascii="Times New Roman" w:hAnsi="Times New Roman"/>
-          <w:sz w:val="20"/>
+          <w:sz w:val="22"/>
         </w:rPr>
         <w:t>— OoO —</w:t>
       </w:r>
     </w:p>
     <w:p>
       <w:pPr>
-        <w:spacing w:before="80" w:after="60"/>
-        <w:jc w:val="center"/>
+        <w:keepNext/>
+        <w:spacing w:before="200" w:after="60"/>
       </w:pPr>
       <w:r>
         <w:rPr>
           <w:rFonts w:ascii="Times New Roman" w:hAnsi="Times New Roman"/>
           <w:b/>
-          <w:color w:val="1F497D"/>
-          <w:sz w:val="29"/>
+          <w:color w:val="000000"/>
+          <w:sz w:val="26"/>
         </w:rPr>
-        <w:t>BÁO CÁO TIẾN ĐỘ THỰC HIỆN ĐỀ TÀI - TUẦN 3 &amp; 4</w:t>
-      </w:r>
-    </w:p>
-    <w:p>
-      <w:pPr>
-        <w:spacing w:after="200"/>
-        <w:jc w:val="center"/>
-      </w:pPr>
-      <w:r>
-        <w:rPr>
-          <w:rFonts w:ascii="Times New Roman" w:hAnsi="Times New Roman"/>
-          <w:b/>
-          <w:color w:val="C00000"/>
-          <w:sz w:val="23"/>
-        </w:rPr>
-        <w:t>Đề tài: NỀN TẢNG QUẢN TRỊ CHUỖI CUNG ỨNG CHỐNG LÃNG PHÍ</w:t>
-        <w:br/>
-        <w:t>(SUPPLY CHAIN SPOILAGE PREDICTOR)</w:t>
+        <w:t>1.  Thông tin sinh viên</w:t>
       </w:r>
     </w:p>
     <w:tbl>
       <w:tblPr>
         <w:tblW w:type="auto" w:w="0"/>
         <w:jc w:val="center"/>
+        <w:tblLayout w:type="fixed"/>
         <w:tblLook w:firstColumn="1" w:firstRow="1" w:lastColumn="0" w:lastRow="0" w:noHBand="0" w:noVBand="1" w:val="04A0"/>
         <w:tblBorders>
-          <w:top w:val="single" w:sz="6" w:space="0" w:color="B0C4DE"/>
-          <w:bottom w:val="single" w:sz="6" w:space="0" w:color="B0C4DE"/>
-          <w:left w:val="single" w:sz="6" w:space="0" w:color="B0C4DE"/>
-          <w:right w:val="single" w:sz="6" w:space="0" w:color="B0C4DE"/>
-          <w:insideH w:val="single" w:sz="6" w:space="0" w:color="B0C4DE"/>
-          <w:insideV w:val="single" w:sz="6" w:space="0" w:color="B0C4DE"/>
+          <w:top w:val="single" w:sz="6" w:space="0" w:color="B0B0B0"/>
+          <w:bottom w:val="single" w:sz="6" w:space="0" w:color="B0B0B0"/>
+          <w:left w:val="single" w:sz="6" w:space="0" w:color="B0B0B0"/>
+          <w:right w:val="single" w:sz="6" w:space="0" w:color="B0B0B0"/>
+          <w:insideH w:val="single" w:sz="6" w:space="0" w:color="B0B0B0"/>
+          <w:insideV w:val="single" w:sz="6" w:space="0" w:color="B0B0B0"/>
         </w:tblBorders>
       </w:tblPr>
       <w:tblGrid>
-        <w:gridCol w:w="4831"/>
-        <w:gridCol w:w="4831"/>
+        <w:gridCol w:w="9662"/>
       </w:tblGrid>
       <w:tr>
         <w:tc>
           <w:tcPr>
-            <w:tcW w:type="dxa" w:w="4831"/>
-            <w:shd w:fill="F4F7FA"/>
+            <w:tcW w:type="dxa" w:w="9648"/>
+            <w:shd w:fill="FAFAFA"/>
             <w:tcMar>
               <w:top w:w="100" w:type="dxa"/>
               <w:bottom w:w="100" w:type="dxa"/>
@@ -95,30 +107,134 @@
             </w:tcMar>
           </w:tcPr>
           <w:p>
+            <w:pPr>
+              <w:spacing w:after="60" w:before="0" w:line="276" w:lineRule="auto"/>
+            </w:pPr>
             <w:r>
               <w:rPr>
                 <w:rFonts w:ascii="Times New Roman" w:hAnsi="Times New Roman"/>
                 <w:b/>
-                <w:sz w:val="20"/>
+                <w:i w:val="0"/>
+                <w:sz w:val="22"/>
               </w:rPr>
-              <w:t>Giảng viên hướng dẫn:</w:t>
-              <w:br/>
+              <w:t xml:space="preserve">MSSV (Đại diện) : </w:t>
             </w:r>
             <w:r>
               <w:rPr>
                 <w:rFonts w:ascii="Times New Roman" w:hAnsi="Times New Roman"/>
-                <w:sz w:val="20"/>
+                <w:b w:val="0"/>
+                <w:i w:val="0"/>
+                <w:sz w:val="22"/>
               </w:rPr>
-              <w:t>ThS. Lê Minh Nhật</w:t>
-              <w:br/>
-              <w:t>Thời gian: 07/09/2026 – 20/09/2026</w:t>
+              <w:t xml:space="preserve">123001364            </w:t>
+            </w:r>
+            <w:r>
+              <w:rPr>
+                <w:rFonts w:ascii="Times New Roman" w:hAnsi="Times New Roman"/>
+                <w:b/>
+                <w:i w:val="0"/>
+                <w:sz w:val="22"/>
+              </w:rPr>
+              <w:t xml:space="preserve">Họ và tên (Đại diện) : </w:t>
+            </w:r>
+            <w:r>
+              <w:rPr>
+                <w:rFonts w:ascii="Times New Roman" w:hAnsi="Times New Roman"/>
+                <w:b w:val="0"/>
+                <w:i w:val="0"/>
+                <w:sz w:val="22"/>
+              </w:rPr>
+              <w:t>Đỗ Tấn Du</w:t>
+            </w:r>
+          </w:p>
+          <w:p>
+            <w:pPr>
+              <w:spacing w:after="60" w:before="0" w:line="276" w:lineRule="auto"/>
+            </w:pPr>
+            <w:r>
+              <w:rPr>
+                <w:rFonts w:ascii="Times New Roman" w:hAnsi="Times New Roman"/>
+                <w:b/>
+                <w:i w:val="0"/>
+                <w:sz w:val="22"/>
+              </w:rPr>
+              <w:t>Danh sách sinh viên trong nhóm:</w:t>
+            </w:r>
+          </w:p>
+          <w:p>
+            <w:pPr>
+              <w:spacing w:after="60" w:before="0" w:line="276" w:lineRule="auto"/>
+            </w:pPr>
+            <w:r>
+              <w:rPr>
+                <w:rFonts w:ascii="Times New Roman" w:hAnsi="Times New Roman"/>
+                <w:b w:val="0"/>
+                <w:i w:val="0"/>
+                <w:sz w:val="22"/>
+              </w:rPr>
+              <w:t>1. Đỗ Tấn Du          - MSSV: 123001364       - Email: 123001364@lhu.edu.vn</w:t>
+            </w:r>
+          </w:p>
+          <w:p>
+            <w:pPr>
+              <w:spacing w:after="60" w:before="0" w:line="276" w:lineRule="auto"/>
+            </w:pPr>
+            <w:r>
+              <w:rPr>
+                <w:rFonts w:ascii="Times New Roman" w:hAnsi="Times New Roman"/>
+                <w:b w:val="0"/>
+                <w:i w:val="0"/>
+                <w:sz w:val="22"/>
+              </w:rPr>
+              <w:t>2. Đoàn Minh Quân - MSSV: 123000946       - Email: 123000946@lhu.edu.vn</w:t>
             </w:r>
           </w:p>
         </w:tc>
+      </w:tr>
+    </w:tbl>
+    <w:p>
+      <w:pPr>
+        <w:spacing w:after="80" w:before="0"/>
+      </w:pPr>
+    </w:p>
+    <w:p>
+      <w:pPr>
+        <w:keepNext/>
+        <w:spacing w:before="200" w:after="60"/>
+      </w:pPr>
+      <w:r>
+        <w:rPr>
+          <w:rFonts w:ascii="Times New Roman" w:hAnsi="Times New Roman"/>
+          <w:b/>
+          <w:color w:val="000000"/>
+          <w:sz w:val="26"/>
+        </w:rPr>
+        <w:t>2.  Thông tin giáo viên hướng dẫn</w:t>
+      </w:r>
+    </w:p>
+    <w:tbl>
+      <w:tblPr>
+        <w:tblW w:type="auto" w:w="0"/>
+        <w:jc w:val="center"/>
+        <w:tblLayout w:type="fixed"/>
+        <w:tblLook w:firstColumn="1" w:firstRow="1" w:lastColumn="0" w:lastRow="0" w:noHBand="0" w:noVBand="1" w:val="04A0"/>
+        <w:tblBorders>
+          <w:top w:val="single" w:sz="6" w:space="0" w:color="B0B0B0"/>
+          <w:bottom w:val="single" w:sz="6" w:space="0" w:color="B0B0B0"/>
+          <w:left w:val="single" w:sz="6" w:space="0" w:color="B0B0B0"/>
+          <w:right w:val="single" w:sz="6" w:space="0" w:color="B0B0B0"/>
+          <w:insideH w:val="single" w:sz="6" w:space="0" w:color="B0B0B0"/>
+          <w:insideV w:val="single" w:sz="6" w:space="0" w:color="B0B0B0"/>
+        </w:tblBorders>
+      </w:tblPr>
+      <w:tblGrid>
+        <w:gridCol w:w="9662"/>
+      </w:tblGrid>
+      <w:tr>
         <w:tc>
           <w:tcPr>
-            <w:tcW w:type="dxa" w:w="4831"/>
-            <w:shd w:fill="F4F7FA"/>
+            <w:tcW w:type="dxa" w:w="9648"/>
+            <w:shd w:fill="FAFAFA"/>
             <w:tcMar>
               <w:top w:w="100" w:type="dxa"/>
               <w:bottom w:w="100" w:type="dxa"/>
@@ -127,23 +243,67 @@
             </w:tcMar>
           </w:tcPr>
           <w:p>
+            <w:pPr>
+              <w:spacing w:after="60" w:before="0" w:line="276" w:lineRule="auto"/>
+            </w:pPr>
             <w:r>
               <w:rPr>
                 <w:rFonts w:ascii="Times New Roman" w:hAnsi="Times New Roman"/>
                 <w:b/>
-                <w:sz w:val="20"/>
+                <w:i w:val="0"/>
+                <w:sz w:val="22"/>
               </w:rPr>
-              <w:t>Nhóm sinh viên thực hiện:</w:t>
-              <w:br/>
+              <w:t xml:space="preserve">Họ và tên GV: </w:t>
             </w:r>
             <w:r>
               <w:rPr>
                 <w:rFonts w:ascii="Times New Roman" w:hAnsi="Times New Roman"/>
-                <w:sz w:val="20"/>
+                <w:b w:val="0"/>
+                <w:i w:val="0"/>
+                <w:sz w:val="22"/>
               </w:rPr>
-              <w:t>1. Đỗ Tấn Du - MSSV: 123001364</w:t>
-              <w:br/>
-              <w:t>2. Đoàn Minh Quân - MSSV: 123000946</w:t>
+              <w:t>ThS. Lê Minh Nhật</w:t>
+            </w:r>
+          </w:p>
+          <w:p>
+            <w:pPr>
+              <w:spacing w:after="60" w:before="0" w:line="276" w:lineRule="auto"/>
+            </w:pPr>
+            <w:r>
+              <w:rPr>
+                <w:rFonts w:ascii="Times New Roman" w:hAnsi="Times New Roman"/>
+                <w:b/>
+                <w:i w:val="0"/>
+                <w:sz w:val="22"/>
+              </w:rPr>
+              <w:t xml:space="preserve">Điện thoại: </w:t>
+            </w:r>
+            <w:r>
+              <w:rPr>
+                <w:rFonts w:ascii="Times New Roman" w:hAnsi="Times New Roman"/>
+                <w:b w:val="0"/>
+                <w:i w:val="0"/>
+                <w:sz w:val="22"/>
+              </w:rPr>
+              <w:t xml:space="preserve">0389571228          </w:t>
+            </w:r>
+            <w:r>
+              <w:rPr>
+                <w:rFonts w:ascii="Times New Roman" w:hAnsi="Times New Roman"/>
+                <w:b/>
+                <w:i w:val="0"/>
+                <w:sz w:val="22"/>
+              </w:rPr>
+              <w:t xml:space="preserve">Email: </w:t>
+            </w:r>
+            <w:r>
+              <w:rPr>
+                <w:rFonts w:ascii="Times New Roman" w:hAnsi="Times New Roman"/>
+                <w:b w:val="0"/>
+                <w:i w:val="0"/>
+                <w:sz w:val="22"/>
+              </w:rPr>
+              <w:t>nhatlm@lhu.edu.vn</w:t>
             </w:r>
           </w:p>
         </w:tc>
@@ -151,121 +311,223 @@
     </w:tbl>
     <w:p>
       <w:pPr>
-        <w:spacing w:after="80"/>
+        <w:spacing w:after="80" w:before="0"/>
       </w:pPr>
     </w:p>
     <w:p>
       <w:pPr>
         <w:keepNext/>
-        <w:spacing w:before="240" w:after="80"/>
+        <w:spacing w:before="200" w:after="60"/>
       </w:pPr>
       <w:r>
         <w:rPr>
           <w:rFonts w:ascii="Times New Roman" w:hAnsi="Times New Roman"/>
           <w:b/>
-          <w:color w:val="1F497D"/>
-          <w:sz w:val="25"/>
+          <w:color w:val="000000"/>
+          <w:sz w:val="26"/>
         </w:rPr>
-        <w:t>1. Mục tiêu đặt ra trong tuần (Khớp mục 4 &amp; 5 Kế hoạch đăng ký)</w:t>
+        <w:t>3.  Tên dự án/ đề tài thực hiện trong học phần</w:t>
       </w:r>
+    </w:p>
+    <w:tbl>
+      <w:tblPr>
+        <w:tblW w:type="auto" w:w="0"/>
+        <w:jc w:val="center"/>
+        <w:tblLayout w:type="fixed"/>
+        <w:tblLook w:firstColumn="1" w:firstRow="1" w:lastColumn="0" w:lastRow="0" w:noHBand="0" w:noVBand="1" w:val="04A0"/>
+        <w:tblBorders>
+          <w:top w:val="single" w:sz="6" w:space="0" w:color="B0B0B0"/>
+          <w:bottom w:val="single" w:sz="6" w:space="0" w:color="B0B0B0"/>
+          <w:left w:val="single" w:sz="6" w:space="0" w:color="B0B0B0"/>
+          <w:right w:val="single" w:sz="6" w:space="0" w:color="B0B0B0"/>
+          <w:insideH w:val="single" w:sz="6" w:space="0" w:color="B0B0B0"/>
+          <w:insideV w:val="single" w:sz="6" w:space="0" w:color="B0B0B0"/>
+        </w:tblBorders>
+      </w:tblPr>
+      <w:tblGrid>
+        <w:gridCol w:w="9662"/>
+      </w:tblGrid>
+      <w:tr>
+        <w:tc>
+          <w:tcPr>
+            <w:tcW w:type="dxa" w:w="9648"/>
+            <w:shd w:fill="FAFAFA"/>
+            <w:tcMar>
+              <w:top w:w="100" w:type="dxa"/>
+              <w:bottom w:w="100" w:type="dxa"/>
+              <w:left w:w="140" w:type="dxa"/>
+              <w:right w:w="140" w:type="dxa"/>
+            </w:tcMar>
+          </w:tcPr>
+          <w:p>
+            <w:pPr>
+              <w:spacing w:after="60" w:before="0" w:line="276" w:lineRule="auto"/>
+            </w:pPr>
+            <w:r>
+              <w:rPr>
+                <w:rFonts w:ascii="Times New Roman" w:hAnsi="Times New Roman"/>
+                <w:b/>
+                <w:i w:val="0"/>
+                <w:sz w:val="22"/>
+              </w:rPr>
+              <w:t>Nền tảng Quản trị Chuỗi cung ứng Chống lãng phí (Supply Chain Spoilage Predictor)</w:t>
+            </w:r>
+          </w:p>
+        </w:tc>
+      </w:tr>
+    </w:tbl>
+    <w:p>
+      <w:pPr>
+        <w:spacing w:after="80" w:before="0"/>
+      </w:pPr>
     </w:p>
     <w:p>
       <w:pPr>
-        <w:pStyle w:val="ListBullet"/>
-        <w:spacing w:after="40" w:line="276" w:lineRule="auto"/>
+        <w:keepNext/>
+        <w:spacing w:before="200" w:after="60"/>
       </w:pPr>
       <w:r>
         <w:rPr>
           <w:rFonts w:ascii="Times New Roman" w:hAnsi="Times New Roman"/>
           <w:b/>
-          <w:sz w:val="21"/>
+          <w:color w:val="000000"/>
+          <w:sz w:val="26"/>
         </w:rPr>
-        <w:t xml:space="preserve">Nghiệp vụ cốt lõi: </w:t>
+        <w:t>4.  Mục tiêu đặt ra trong tuần (Khớp STT 4 &amp; 5 Kế hoạch đề tài)</w:t>
       </w:r>
-      <w:r>
-        <w:rPr>
-          <w:rFonts w:ascii="Times New Roman" w:hAnsi="Times New Roman"/>
-          <w:sz w:val="21"/>
-        </w:rPr>
-        <w:t>Tinh gọn mô hình hệ thống theo góp ý của GVHD Lê Minh Nhật (tập trung mô hình Bán lẻ Retail: Kho tổng DC -&gt; Cửa hàng -&gt; Khách hàng; bán hàng ra = xuất kho FEFO; loại bỏ điều chuyển nội bộ và thủ tục trả hàng phức tạp).</w:t>
-      </w:r>
+    </w:p>
+    <w:tbl>
+      <w:tblPr>
+        <w:tblW w:type="auto" w:w="0"/>
+        <w:jc w:val="center"/>
+        <w:tblLayout w:type="fixed"/>
+        <w:tblLook w:firstColumn="1" w:firstRow="1" w:lastColumn="0" w:lastRow="0" w:noHBand="0" w:noVBand="1" w:val="04A0"/>
+        <w:tblBorders>
+          <w:top w:val="single" w:sz="6" w:space="0" w:color="B0B0B0"/>
+          <w:bottom w:val="single" w:sz="6" w:space="0" w:color="B0B0B0"/>
+          <w:left w:val="single" w:sz="6" w:space="0" w:color="B0B0B0"/>
+          <w:right w:val="single" w:sz="6" w:space="0" w:color="B0B0B0"/>
+          <w:insideH w:val="single" w:sz="6" w:space="0" w:color="B0B0B0"/>
+          <w:insideV w:val="single" w:sz="6" w:space="0" w:color="B0B0B0"/>
+        </w:tblBorders>
+      </w:tblPr>
+      <w:tblGrid>
+        <w:gridCol w:w="9662"/>
+      </w:tblGrid>
+      <w:tr>
+        <w:tc>
+          <w:tcPr>
+            <w:tcW w:type="dxa" w:w="9648"/>
+            <w:shd w:fill="FAFAFA"/>
+            <w:tcMar>
+              <w:top w:w="100" w:type="dxa"/>
+              <w:bottom w:w="100" w:type="dxa"/>
+              <w:left w:w="140" w:type="dxa"/>
+              <w:right w:w="140" w:type="dxa"/>
+            </w:tcMar>
+          </w:tcPr>
+          <w:p>
+            <w:pPr>
+              <w:spacing w:after="60" w:before="0" w:line="276" w:lineRule="auto"/>
+            </w:pPr>
+            <w:r>
+              <w:rPr>
+                <w:rFonts w:ascii="Times New Roman" w:hAnsi="Times New Roman"/>
+                <w:b/>
+                <w:i w:val="0"/>
+                <w:sz w:val="22"/>
+              </w:rPr>
+              <w:t xml:space="preserve">Mục tiêu tuần 3: </w:t>
+            </w:r>
+            <w:r>
+              <w:rPr>
+                <w:rFonts w:ascii="Times New Roman" w:hAnsi="Times New Roman"/>
+                <w:sz w:val="22"/>
+              </w:rPr>
+              <w:t>Hoàn thiện thiết kế Cơ sở dữ liệu, bộ sơ đồ hệ thống và cấu trúc mã nguồn.</w:t>
+            </w:r>
+          </w:p>
+          <w:p>
+            <w:pPr>
+              <w:spacing w:after="60" w:before="0" w:line="276" w:lineRule="auto"/>
+            </w:pPr>
+            <w:r>
+              <w:rPr>
+                <w:rFonts w:ascii="Times New Roman" w:hAnsi="Times New Roman"/>
+                <w:sz w:val="22"/>
+              </w:rPr>
+              <w:t>- Tinh gọn mô hình hệ thống theo lời dặn của GVHD ThS. Lê Minh Nhật: Bán hàng ra = Xuất kho (Sales Out); bỏ luân chuyển ngang và trả hàng lỗi rườm rà.</w:t>
+            </w:r>
+          </w:p>
+          <w:p>
+            <w:pPr>
+              <w:spacing w:after="60" w:before="0" w:line="276" w:lineRule="auto"/>
+            </w:pPr>
+            <w:r>
+              <w:rPr>
+                <w:rFonts w:ascii="Times New Roman" w:hAnsi="Times New Roman"/>
+                <w:sz w:val="22"/>
+              </w:rPr>
+              <w:t>- Chuẩn hóa 3 ngưỡng an toàn khoa học: Ngưỡng cận date theo % Vòng đời còn lại (RSL), Ngưỡng tồn kho tối thiểu (ROP = d*L + SS) và Ngưỡng rủi ro hư hỏng (DOS &gt; DUE).</w:t>
+            </w:r>
+          </w:p>
+          <w:p>
+            <w:pPr>
+              <w:spacing w:after="60" w:before="0" w:line="276" w:lineRule="auto"/>
+            </w:pPr>
+            <w:r>
+              <w:rPr>
+                <w:rFonts w:ascii="Times New Roman" w:hAnsi="Times New Roman"/>
+                <w:sz w:val="22"/>
+              </w:rPr>
+              <w:t>- Thiết kế hoàn chỉnh bộ Sơ đồ Use Case (phân quyền Quản lý/Nhân viên) và Sơ đồ DFD Mức 0, Mức 1 (5 tiến trình, 3 kho dữ liệu).</w:t>
+            </w:r>
+          </w:p>
+          <w:p>
+            <w:pPr>
+              <w:spacing w:after="60" w:before="0" w:line="276" w:lineRule="auto"/>
+            </w:pPr>
+            <w:r>
+              <w:rPr>
+                <w:rFonts w:ascii="Times New Roman" w:hAnsi="Times New Roman"/>
+                <w:sz w:val="22"/>
+              </w:rPr>
+              <w:t>- Xây dựng và nạp CSDL Microsoft SQL Server (12 bảng chuẩn 3NF, 4 Views tính hạn dùng &amp; gợi ý nhập hàng động, Stored Procedures FEFO, Triggers).</w:t>
+            </w:r>
+          </w:p>
+          <w:p>
+            <w:pPr>
+              <w:spacing w:after="60" w:before="0" w:line="276" w:lineRule="auto"/>
+            </w:pPr>
+            <w:r>
+              <w:rPr>
+                <w:rFonts w:ascii="Times New Roman" w:hAnsi="Times New Roman"/>
+                <w:sz w:val="22"/>
+              </w:rPr>
+              <w:t>- Viết script kiểm thử CSDL tự động bằng Python; khởi tạo Git và đưa mã nguồn lên GitHub.</w:t>
+            </w:r>
+          </w:p>
+        </w:tc>
+      </w:tr>
+    </w:tbl>
+    <w:p>
+      <w:pPr>
+        <w:spacing w:after="80" w:before="0"/>
+      </w:pPr>
     </w:p>
     <w:p>
       <w:pPr>
-        <w:pStyle w:val="ListBullet"/>
-        <w:spacing w:after="40" w:line="276" w:lineRule="auto"/>
+        <w:keepNext/>
+        <w:spacing w:before="200" w:after="60"/>
       </w:pPr>
       <w:r>
         <w:rPr>
           <w:rFonts w:ascii="Times New Roman" w:hAnsi="Times New Roman"/>
           <w:b/>
-          <w:sz w:val="21"/>
+          <w:color w:val="000000"/>
+          <w:sz w:val="26"/>
         </w:rPr>
-        <w:t xml:space="preserve">Chuẩn hóa công thức &amp; thiết kế: </w:t>
-      </w:r>
-      <w:r>
-        <w:rPr>
-          <w:rFonts w:ascii="Times New Roman" w:hAnsi="Times New Roman"/>
-          <w:sz w:val="21"/>
-        </w:rPr>
-        <w:t>Xây dựng 3 ngưỡng an toàn khoa học (Ngưỡng cận date theo % vòng đời RSL, Ngưỡng tồn kho tối thiểu ROP, Ngưỡng nguy cơ hư hỏng Spoilage Risk). Hoàn thiện bộ sơ đồ Use Case và DFD Mức 0, Mức 1.</w:t>
-      </w:r>
-    </w:p>
-    <w:p>
-      <w:pPr>
-        <w:pStyle w:val="ListBullet"/>
-        <w:spacing w:after="40" w:line="276" w:lineRule="auto"/>
-      </w:pPr>
-      <w:r>
-        <w:rPr>
-          <w:rFonts w:ascii="Times New Roman" w:hAnsi="Times New Roman"/>
-          <w:b/>
-          <w:sz w:val="21"/>
-        </w:rPr>
-        <w:t xml:space="preserve">Hiện thực hóa Cơ sở dữ liệu: </w:t>
-      </w:r>
-      <w:r>
-        <w:rPr>
-          <w:rFonts w:ascii="Times New Roman" w:hAnsi="Times New Roman"/>
-          <w:sz w:val="21"/>
-        </w:rPr>
-        <w:t>Thiết kế và nạp CSDL quan hệ chuẩn 3NF vào Microsoft SQL Server (SSMS), viết Stored Procedures, Views cảnh báo và Triggers tự động.</w:t>
-      </w:r>
-    </w:p>
-    <w:p>
-      <w:pPr>
-        <w:pStyle w:val="ListBullet"/>
-        <w:spacing w:after="40" w:line="276" w:lineRule="auto"/>
-      </w:pPr>
-      <w:r>
-        <w:rPr>
-          <w:rFonts w:ascii="Times New Roman" w:hAnsi="Times New Roman"/>
-          <w:b/>
-          <w:sz w:val="21"/>
-        </w:rPr>
-        <w:t xml:space="preserve">Hạ tầng mã nguồn: </w:t>
-      </w:r>
-      <w:r>
-        <w:rPr>
-          <w:rFonts w:ascii="Times New Roman" w:hAnsi="Times New Roman"/>
-          <w:sz w:val="21"/>
-        </w:rPr>
-        <w:t>Khởi tạo Git, đẩy toàn bộ mã nguồn lên GitHub và kết nối cộng tác giữa các thành viên nhóm.</w:t>
-      </w:r>
-    </w:p>
-    <w:p>
-      <w:pPr>
-        <w:keepNext/>
-        <w:spacing w:before="240" w:after="80"/>
-      </w:pPr>
-      <w:r>
-        <w:rPr>
-          <w:rFonts w:ascii="Times New Roman" w:hAnsi="Times New Roman"/>
-          <w:b/>
-          <w:color w:val="1F497D"/>
-          <w:sz w:val="25"/>
-        </w:rPr>
-        <w:t>2. Các công việc cụ thể đã hoàn thành trong tuần</w:t>
+        <w:t>5.  Nội dung công việc và kết quả thực hiện</w:t>
       </w:r>
     </w:p>
     <w:tbl>
@@ -275,12 +537,12 @@
         <w:tblLook w:firstColumn="1" w:firstRow="1" w:lastColumn="0" w:lastRow="0" w:noHBand="0" w:noVBand="1" w:val="04A0"/>
         <w:jc w:val="center"/>
         <w:tblBorders>
-          <w:top w:val="single" w:sz="4" w:space="0" w:color="B0C4DE"/>
-          <w:bottom w:val="single" w:sz="4" w:space="0" w:color="B0C4DE"/>
-          <w:left w:val="single" w:sz="4" w:space="0" w:color="B0C4DE"/>
-          <w:right w:val="single" w:sz="4" w:space="0" w:color="B0C4DE"/>
-          <w:insideH w:val="single" w:sz="4" w:space="0" w:color="B0C4DE"/>
-          <w:insideV w:val="single" w:sz="4" w:space="0" w:color="B0C4DE"/>
+          <w:top w:val="single" w:sz="4" w:space="0" w:color="7F8C8D"/>
+          <w:bottom w:val="single" w:sz="4" w:space="0" w:color="7F8C8D"/>
+          <w:left w:val="single" w:sz="4" w:space="0" w:color="7F8C8D"/>
+          <w:right w:val="single" w:sz="4" w:space="0" w:color="7F8C8D"/>
+          <w:insideH w:val="single" w:sz="4" w:space="0" w:color="7F8C8D"/>
+          <w:insideV w:val="single" w:sz="4" w:space="0" w:color="7F8C8D"/>
         </w:tblBorders>
       </w:tblPr>
       <w:tblGrid>
@@ -294,12 +556,12 @@
         <w:tc>
           <w:tcPr>
             <w:tcW w:type="dxa" w:w="648"/>
-            <w:shd w:fill="1F497D"/>
+            <w:shd w:fill="EAECEE"/>
             <w:tcMar>
               <w:top w:w="120" w:type="dxa"/>
               <w:bottom w:w="120" w:type="dxa"/>
-              <w:left w:w="120" w:type="dxa"/>
-              <w:right w:w="120" w:type="dxa"/>
+              <w:left w:w="100" w:type="dxa"/>
+              <w:right w:w="100" w:type="dxa"/>
             </w:tcMar>
           </w:tcPr>
           <w:p>
@@ -310,8 +572,8 @@
               <w:rPr>
                 <w:rFonts w:ascii="Times New Roman" w:hAnsi="Times New Roman"/>
                 <w:b/>
-                <w:color w:val="FFFFFF"/>
-                <w:sz w:val="20"/>
+                <w:color w:val="141414"/>
+                <w:sz w:val="21"/>
               </w:rPr>
               <w:t>STT</w:t>
             </w:r>
@@ -320,12 +582,12 @@
         <w:tc>
           <w:tcPr>
             <w:tcW w:type="dxa" w:w="3672"/>
-            <w:shd w:fill="1F497D"/>
+            <w:shd w:fill="EAECEE"/>
             <w:tcMar>
               <w:top w:w="120" w:type="dxa"/>
               <w:bottom w:w="120" w:type="dxa"/>
-              <w:left w:w="120" w:type="dxa"/>
-              <w:right w:w="120" w:type="dxa"/>
+              <w:left w:w="100" w:type="dxa"/>
+              <w:right w:w="100" w:type="dxa"/>
             </w:tcMar>
           </w:tcPr>
           <w:p>
@@ -336,22 +598,22 @@
               <w:rPr>
                 <w:rFonts w:ascii="Times New Roman" w:hAnsi="Times New Roman"/>
                 <w:b/>
-                <w:color w:val="FFFFFF"/>
-                <w:sz w:val="20"/>
+                <w:color w:val="141414"/>
+                <w:sz w:val="21"/>
               </w:rPr>
-              <w:t>Nội Dung Công Việc Đã Thực Hiện</w:t>
+              <w:t>Nội Dung Công Việc</w:t>
             </w:r>
           </w:p>
         </w:tc>
         <w:tc>
           <w:tcPr>
             <w:tcW w:type="dxa" w:w="1728"/>
-            <w:shd w:fill="1F497D"/>
+            <w:shd w:fill="EAECEE"/>
             <w:tcMar>
               <w:top w:w="120" w:type="dxa"/>
               <w:bottom w:w="120" w:type="dxa"/>
-              <w:left w:w="120" w:type="dxa"/>
-              <w:right w:w="120" w:type="dxa"/>
+              <w:left w:w="100" w:type="dxa"/>
+              <w:right w:w="100" w:type="dxa"/>
             </w:tcMar>
           </w:tcPr>
           <w:p>
@@ -362,22 +624,22 @@
               <w:rPr>
                 <w:rFonts w:ascii="Times New Roman" w:hAnsi="Times New Roman"/>
                 <w:b/>
-                <w:color w:val="FFFFFF"/>
-                <w:sz w:val="20"/>
+                <w:color w:val="141414"/>
+                <w:sz w:val="21"/>
               </w:rPr>
-              <w:t>Người Phụ Trách</w:t>
+              <w:t>Người Thực Hiện</w:t>
             </w:r>
           </w:p>
         </w:tc>
         <w:tc>
           <w:tcPr>
             <w:tcW w:type="dxa" w:w="2736"/>
-            <w:shd w:fill="1F497D"/>
+            <w:shd w:fill="EAECEE"/>
             <w:tcMar>
               <w:top w:w="120" w:type="dxa"/>
               <w:bottom w:w="120" w:type="dxa"/>
-              <w:left w:w="120" w:type="dxa"/>
-              <w:right w:w="120" w:type="dxa"/>
+              <w:left w:w="100" w:type="dxa"/>
+              <w:right w:w="100" w:type="dxa"/>
             </w:tcMar>
           </w:tcPr>
           <w:p>
@@ -388,8 +650,8 @@
               <w:rPr>
                 <w:rFonts w:ascii="Times New Roman" w:hAnsi="Times New Roman"/>
                 <w:b/>
-                <w:color w:val="FFFFFF"/>
-                <w:sz w:val="20"/>
+                <w:color w:val="141414"/>
+                <w:sz w:val="21"/>
               </w:rPr>
               <w:t>Sản Phẩm Đạt Được</w:t>
             </w:r>
@@ -398,12 +660,12 @@
         <w:tc>
           <w:tcPr>
             <w:tcW w:type="dxa" w:w="936"/>
-            <w:shd w:fill="1F497D"/>
+            <w:shd w:fill="EAECEE"/>
             <w:tcMar>
               <w:top w:w="120" w:type="dxa"/>
               <w:bottom w:w="120" w:type="dxa"/>
-              <w:left w:w="120" w:type="dxa"/>
-              <w:right w:w="120" w:type="dxa"/>
+              <w:left w:w="100" w:type="dxa"/>
+              <w:right w:w="100" w:type="dxa"/>
             </w:tcMar>
           </w:tcPr>
           <w:p>
@@ -414,8 +676,8 @@
               <w:rPr>
                 <w:rFonts w:ascii="Times New Roman" w:hAnsi="Times New Roman"/>
                 <w:b/>
-                <w:color w:val="FFFFFF"/>
-                <w:sz w:val="20"/>
+                <w:color w:val="141414"/>
+                <w:sz w:val="21"/>
               </w:rPr>
               <w:t>Tiến Độ</w:t>
             </w:r>
@@ -442,7 +704,7 @@
               <w:rPr>
                 <w:rFonts w:ascii="Times New Roman" w:hAnsi="Times New Roman"/>
                 <w:color w:val="1E1E1E"/>
-                <w:sz w:val="19"/>
+                <w:sz w:val="20"/>
               </w:rPr>
               <w:t>1</w:t>
             </w:r>
@@ -467,9 +729,9 @@
               <w:rPr>
                 <w:rFonts w:ascii="Times New Roman" w:hAnsi="Times New Roman"/>
                 <w:color w:val="1E1E1E"/>
-                <w:sz w:val="19"/>
+                <w:sz w:val="20"/>
               </w:rPr>
-              <w:t>Phân tích &amp; tinh gọn quy trình bán lẻ theo dặn dò của GVHD. Chuẩn hóa 8 yêu cầu chức năng (FR) và 4 phi chức năng (NFR). Thiết lập bảng hệ số tiêu thụ K (thời tiết, ngày lễ) và 3 ngưỡng an toàn (RSL, ROP, Spoilage DOS &gt; DUE).</w:t>
+              <w:t>Phân tích &amp; tinh gọn quy trình bán lẻ theo dặn dò của GVHD. Chuẩn hóa 8 yêu cầu chức năng (FR), 4 phi chức năng (NFR) và 3 ngưỡng an toàn (RSL, ROP, Spoilage Risk).</w:t>
             </w:r>
           </w:p>
         </w:tc>
@@ -486,13 +748,13 @@
           </w:tcPr>
           <w:p>
             <w:pPr>
-              <w:jc w:val="center"/>
+              <w:jc w:val="left"/>
             </w:pPr>
             <w:r>
               <w:rPr>
                 <w:rFonts w:ascii="Times New Roman" w:hAnsi="Times New Roman"/>
                 <w:color w:val="1E1E1E"/>
-                <w:sz w:val="19"/>
+                <w:sz w:val="20"/>
               </w:rPr>
               <w:t>Đỗ Tấn Du</w:t>
               <w:br/>
@@ -519,7 +781,7 @@
               <w:rPr>
                 <w:rFonts w:ascii="Times New Roman" w:hAnsi="Times New Roman"/>
                 <w:color w:val="1E1E1E"/>
-                <w:sz w:val="19"/>
+                <w:sz w:val="20"/>
               </w:rPr>
               <w:t>Tài liệu thuyết minh hoàn chỉnh: Docs/BAO_CAO_NGHIEP_VU_VA_KIEN_TRUC_NOP_THAY.docx</w:t>
             </w:r>
@@ -544,7 +806,7 @@
               <w:rPr>
                 <w:rFonts w:ascii="Times New Roman" w:hAnsi="Times New Roman"/>
                 <w:color w:val="1E1E1E"/>
-                <w:sz w:val="19"/>
+                <w:sz w:val="20"/>
               </w:rPr>
               <w:t>100%</w:t>
             </w:r>
@@ -555,7 +817,7 @@
         <w:tc>
           <w:tcPr>
             <w:tcW w:type="dxa" w:w="648"/>
-            <w:shd w:fill="F4F7FA"/>
+            <w:shd w:fill="F9FAFB"/>
             <w:tcMar>
               <w:top w:w="80" w:type="dxa"/>
               <w:bottom w:w="80" w:type="dxa"/>
@@ -571,7 +833,7 @@
               <w:rPr>
                 <w:rFonts w:ascii="Times New Roman" w:hAnsi="Times New Roman"/>
                 <w:color w:val="1E1E1E"/>
-                <w:sz w:val="19"/>
+                <w:sz w:val="20"/>
               </w:rPr>
               <w:t>2</w:t>
             </w:r>
@@ -580,7 +842,7 @@
         <w:tc>
           <w:tcPr>
             <w:tcW w:type="dxa" w:w="3672"/>
-            <w:shd w:fill="F4F7FA"/>
+            <w:shd w:fill="F9FAFB"/>
             <w:tcMar>
               <w:top w:w="80" w:type="dxa"/>
               <w:bottom w:w="80" w:type="dxa"/>
@@ -596,16 +858,66 @@
               <w:rPr>
                 <w:rFonts w:ascii="Times New Roman" w:hAnsi="Times New Roman"/>
                 <w:color w:val="1E1E1E"/>
-                <w:sz w:val="19"/>
+                <w:sz w:val="20"/>
               </w:rPr>
-              <w:t>Thiết kế Sơ đồ Use Case (9 chức năng phân quyền Staff/Manager) và Sơ đồ luồng dữ liệu DFD Mức 0 (Context) &amp; DFD Mức 1 (5 tiến trình nghiệp vụ, 3 kho dữ liệu cốt lõi).</w:t>
+              <w:t>Thiết kế Sơ đồ Use Case (9 chức năng) và Sơ đồ luồng dữ liệu DFD Mức 0 (Context), DFD Mức 1 (5 tiến trình, 3 kho dữ liệu cốt lõi).</w:t>
             </w:r>
           </w:p>
         </w:tc>
         <w:tc>
           <w:tcPr>
             <w:tcW w:type="dxa" w:w="1728"/>
-            <w:shd w:fill="F4F7FA"/>
+            <w:shd w:fill="F9FAFB"/>
+            <w:tcMar>
+              <w:top w:w="80" w:type="dxa"/>
+              <w:bottom w:w="80" w:type="dxa"/>
+              <w:left w:w="100" w:type="dxa"/>
+              <w:right w:w="100" w:type="dxa"/>
+            </w:tcMar>
+          </w:tcPr>
+          <w:p>
+            <w:pPr>
+              <w:jc w:val="left"/>
+            </w:pPr>
+            <w:r>
+              <w:rPr>
+                <w:rFonts w:ascii="Times New Roman" w:hAnsi="Times New Roman"/>
+                <w:color w:val="1E1E1E"/>
+                <w:sz w:val="20"/>
+              </w:rPr>
+              <w:t>Đỗ Tấn Du</w:t>
+            </w:r>
+          </w:p>
+        </w:tc>
+        <w:tc>
+          <w:tcPr>
+            <w:tcW w:type="dxa" w:w="2736"/>
+            <w:shd w:fill="F9FAFB"/>
+            <w:tcMar>
+              <w:top w:w="80" w:type="dxa"/>
+              <w:bottom w:w="80" w:type="dxa"/>
+              <w:left w:w="100" w:type="dxa"/>
+              <w:right w:w="100" w:type="dxa"/>
+            </w:tcMar>
+          </w:tcPr>
+          <w:p>
+            <w:pPr>
+              <w:jc w:val="left"/>
+            </w:pPr>
+            <w:r>
+              <w:rPr>
+                <w:rFonts w:ascii="Times New Roman" w:hAnsi="Times New Roman"/>
+                <w:color w:val="1E1E1E"/>
+                <w:sz w:val="20"/>
+              </w:rPr>
+              <w:t>Bộ ảnh sơ đồ hoàn chỉnh tại Docs/Diagram_Images/ (use_case.png, dfd_0.png, dfd_1.png)</w:t>
+            </w:r>
+          </w:p>
+        </w:tc>
+        <w:tc>
+          <w:tcPr>
+            <w:tcW w:type="dxa" w:w="936"/>
+            <w:shd w:fill="F9FAFB"/>
             <w:tcMar>
               <w:top w:w="80" w:type="dxa"/>
               <w:bottom w:w="80" w:type="dxa"/>
@@ -621,57 +933,7 @@
               <w:rPr>
                 <w:rFonts w:ascii="Times New Roman" w:hAnsi="Times New Roman"/>
                 <w:color w:val="1E1E1E"/>
-                <w:sz w:val="19"/>
-              </w:rPr>
-              <w:t>Đỗ Tấn Du</w:t>
-            </w:r>
-          </w:p>
-        </w:tc>
-        <w:tc>
-          <w:tcPr>
-            <w:tcW w:type="dxa" w:w="2736"/>
-            <w:shd w:fill="F4F7FA"/>
-            <w:tcMar>
-              <w:top w:w="80" w:type="dxa"/>
-              <w:bottom w:w="80" w:type="dxa"/>
-              <w:left w:w="100" w:type="dxa"/>
-              <w:right w:w="100" w:type="dxa"/>
-            </w:tcMar>
-          </w:tcPr>
-          <w:p>
-            <w:pPr>
-              <w:jc w:val="left"/>
-            </w:pPr>
-            <w:r>
-              <w:rPr>
-                <w:rFonts w:ascii="Times New Roman" w:hAnsi="Times New Roman"/>
-                <w:color w:val="1E1E1E"/>
-                <w:sz w:val="19"/>
-              </w:rPr>
-              <w:t>Bộ ảnh sơ đồ hoàn chỉnh tại Docs/Diagram_Images/ (use_case.png, dfd_0.png, dfd_1.png)</w:t>
-            </w:r>
-          </w:p>
-        </w:tc>
-        <w:tc>
-          <w:tcPr>
-            <w:tcW w:type="dxa" w:w="936"/>
-            <w:shd w:fill="F4F7FA"/>
-            <w:tcMar>
-              <w:top w:w="80" w:type="dxa"/>
-              <w:bottom w:w="80" w:type="dxa"/>
-              <w:left w:w="100" w:type="dxa"/>
-              <w:right w:w="100" w:type="dxa"/>
-            </w:tcMar>
-          </w:tcPr>
-          <w:p>
-            <w:pPr>
-              <w:jc w:val="center"/>
-            </w:pPr>
-            <w:r>
-              <w:rPr>
-                <w:rFonts w:ascii="Times New Roman" w:hAnsi="Times New Roman"/>
-                <w:color w:val="1E1E1E"/>
-                <w:sz w:val="19"/>
+                <w:sz w:val="20"/>
               </w:rPr>
               <w:t>100%</w:t>
             </w:r>
@@ -698,7 +960,7 @@
               <w:rPr>
                 <w:rFonts w:ascii="Times New Roman" w:hAnsi="Times New Roman"/>
                 <w:color w:val="1E1E1E"/>
-                <w:sz w:val="19"/>
+                <w:sz w:val="20"/>
               </w:rPr>
               <w:t>3</w:t>
             </w:r>
@@ -723,9 +985,9 @@
               <w:rPr>
                 <w:rFonts w:ascii="Times New Roman" w:hAnsi="Times New Roman"/>
                 <w:color w:val="1E1E1E"/>
-                <w:sz w:val="19"/>
+                <w:sz w:val="20"/>
               </w:rPr>
-              <w:t>Xây dựng &amp; tối ưu CSDL Microsoft SQL Server (T-SQL): 12 bảng chuẩn 3NF, 4 Views tính hạn dùng &amp; gợi ý nhập hàng động, Stored Procedure xuất kho FEFO tự động, Function tính rủi ro fn_calculate_spoilage_risk, Trigger trg_after_spoilage_insert.</w:t>
+              <w:t>Hiện thực hóa CSDL Microsoft SQL Server (T-SQL): 12 bảng 3NF, 4 Views cảnh báo hạn &amp; gợi ý nhập, Stored Procedures trừ kho FEFO, Function &amp; Trigger tự động.</w:t>
             </w:r>
           </w:p>
         </w:tc>
@@ -742,13 +1004,13 @@
           </w:tcPr>
           <w:p>
             <w:pPr>
-              <w:jc w:val="center"/>
+              <w:jc w:val="left"/>
             </w:pPr>
             <w:r>
               <w:rPr>
                 <w:rFonts w:ascii="Times New Roman" w:hAnsi="Times New Roman"/>
                 <w:color w:val="1E1E1E"/>
-                <w:sz w:val="19"/>
+                <w:sz w:val="20"/>
               </w:rPr>
               <w:t>Đoàn Minh Quân</w:t>
               <w:br/>
@@ -775,7 +1037,7 @@
               <w:rPr>
                 <w:rFonts w:ascii="Times New Roman" w:hAnsi="Times New Roman"/>
                 <w:color w:val="1E1E1E"/>
-                <w:sz w:val="19"/>
+                <w:sz w:val="20"/>
               </w:rPr>
               <w:t>File kịch bản Database/retail_spoilage_database.sql nạp thành công vào SSMS LocalDB</w:t>
             </w:r>
@@ -800,7 +1062,7 @@
               <w:rPr>
                 <w:rFonts w:ascii="Times New Roman" w:hAnsi="Times New Roman"/>
                 <w:color w:val="1E1E1E"/>
-                <w:sz w:val="19"/>
+                <w:sz w:val="20"/>
               </w:rPr>
               <w:t>100%</w:t>
             </w:r>
@@ -811,7 +1073,7 @@
         <w:tc>
           <w:tcPr>
             <w:tcW w:type="dxa" w:w="648"/>
-            <w:shd w:fill="F4F7FA"/>
+            <w:shd w:fill="F9FAFB"/>
             <w:tcMar>
               <w:top w:w="80" w:type="dxa"/>
               <w:bottom w:w="80" w:type="dxa"/>
@@ -827,7 +1089,7 @@
               <w:rPr>
                 <w:rFonts w:ascii="Times New Roman" w:hAnsi="Times New Roman"/>
                 <w:color w:val="1E1E1E"/>
-                <w:sz w:val="19"/>
+                <w:sz w:val="20"/>
               </w:rPr>
               <w:t>4</w:t>
             </w:r>
@@ -836,7 +1098,7 @@
         <w:tc>
           <w:tcPr>
             <w:tcW w:type="dxa" w:w="3672"/>
-            <w:shd w:fill="F4F7FA"/>
+            <w:shd w:fill="F9FAFB"/>
             <w:tcMar>
               <w:top w:w="80" w:type="dxa"/>
               <w:bottom w:w="80" w:type="dxa"/>
@@ -852,16 +1114,66 @@
               <w:rPr>
                 <w:rFonts w:ascii="Times New Roman" w:hAnsi="Times New Roman"/>
                 <w:color w:val="1E1E1E"/>
-                <w:sz w:val="19"/>
+                <w:sz w:val="20"/>
               </w:rPr>
-              <w:t>Viết kịch bản kiểm thử CSDL tự động bằng Python, kết nối và kiểm tra tính toàn vẹn khóa ngoại, logic cảnh báo cận date và cơ chế trừ kho FEFO.</w:t>
+              <w:t>Viết kịch bản kiểm thử CSDL tự động bằng Python, kiểm tra chính xác tính toàn vẹn dữ liệu, logic cảnh báo cận date và cơ chế xuất kho FEFO.</w:t>
             </w:r>
           </w:p>
         </w:tc>
         <w:tc>
           <w:tcPr>
             <w:tcW w:type="dxa" w:w="1728"/>
-            <w:shd w:fill="F4F7FA"/>
+            <w:shd w:fill="F9FAFB"/>
+            <w:tcMar>
+              <w:top w:w="80" w:type="dxa"/>
+              <w:bottom w:w="80" w:type="dxa"/>
+              <w:left w:w="100" w:type="dxa"/>
+              <w:right w:w="100" w:type="dxa"/>
+            </w:tcMar>
+          </w:tcPr>
+          <w:p>
+            <w:pPr>
+              <w:jc w:val="left"/>
+            </w:pPr>
+            <w:r>
+              <w:rPr>
+                <w:rFonts w:ascii="Times New Roman" w:hAnsi="Times New Roman"/>
+                <w:color w:val="1E1E1E"/>
+                <w:sz w:val="20"/>
+              </w:rPr>
+              <w:t>Đỗ Tấn Du</w:t>
+            </w:r>
+          </w:p>
+        </w:tc>
+        <w:tc>
+          <w:tcPr>
+            <w:tcW w:type="dxa" w:w="2736"/>
+            <w:shd w:fill="F9FAFB"/>
+            <w:tcMar>
+              <w:top w:w="80" w:type="dxa"/>
+              <w:bottom w:w="80" w:type="dxa"/>
+              <w:left w:w="100" w:type="dxa"/>
+              <w:right w:w="100" w:type="dxa"/>
+            </w:tcMar>
+          </w:tcPr>
+          <w:p>
+            <w:pPr>
+              <w:jc w:val="left"/>
+            </w:pPr>
+            <w:r>
+              <w:rPr>
+                <w:rFonts w:ascii="Times New Roman" w:hAnsi="Times New Roman"/>
+                <w:color w:val="1E1E1E"/>
+                <w:sz w:val="20"/>
+              </w:rPr>
+              <w:t>File Database/test_database_runner.py chạy pass 100% các ca kiểm thử</w:t>
+            </w:r>
+          </w:p>
+        </w:tc>
+        <w:tc>
+          <w:tcPr>
+            <w:tcW w:type="dxa" w:w="936"/>
+            <w:shd w:fill="F9FAFB"/>
             <w:tcMar>
               <w:top w:w="80" w:type="dxa"/>
               <w:bottom w:w="80" w:type="dxa"/>
@@ -877,57 +1189,7 @@
               <w:rPr>
                 <w:rFonts w:ascii="Times New Roman" w:hAnsi="Times New Roman"/>
                 <w:color w:val="1E1E1E"/>
-                <w:sz w:val="19"/>
-              </w:rPr>
-              <w:t>Đỗ Tấn Du</w:t>
-            </w:r>
-          </w:p>
-        </w:tc>
-        <w:tc>
-          <w:tcPr>
-            <w:tcW w:type="dxa" w:w="2736"/>
-            <w:shd w:fill="F4F7FA"/>
-            <w:tcMar>
-              <w:top w:w="80" w:type="dxa"/>
-              <w:bottom w:w="80" w:type="dxa"/>
-              <w:left w:w="100" w:type="dxa"/>
-              <w:right w:w="100" w:type="dxa"/>
-            </w:tcMar>
-          </w:tcPr>
-          <w:p>
-            <w:pPr>
-              <w:jc w:val="left"/>
-            </w:pPr>
-            <w:r>
-              <w:rPr>
-                <w:rFonts w:ascii="Times New Roman" w:hAnsi="Times New Roman"/>
-                <w:color w:val="1E1E1E"/>
-                <w:sz w:val="19"/>
-              </w:rPr>
-              <w:t>File Database/test_database_runner.py chạy pass 100% các ca kiểm thử</w:t>
-            </w:r>
-          </w:p>
-        </w:tc>
-        <w:tc>
-          <w:tcPr>
-            <w:tcW w:type="dxa" w:w="936"/>
-            <w:shd w:fill="F4F7FA"/>
-            <w:tcMar>
-              <w:top w:w="80" w:type="dxa"/>
-              <w:bottom w:w="80" w:type="dxa"/>
-              <w:left w:w="100" w:type="dxa"/>
-              <w:right w:w="100" w:type="dxa"/>
-            </w:tcMar>
-          </w:tcPr>
-          <w:p>
-            <w:pPr>
-              <w:jc w:val="center"/>
-            </w:pPr>
-            <w:r>
-              <w:rPr>
-                <w:rFonts w:ascii="Times New Roman" w:hAnsi="Times New Roman"/>
-                <w:color w:val="1E1E1E"/>
-                <w:sz w:val="19"/>
+                <w:sz w:val="20"/>
               </w:rPr>
               <w:t>100%</w:t>
             </w:r>
@@ -954,7 +1216,7 @@
               <w:rPr>
                 <w:rFonts w:ascii="Times New Roman" w:hAnsi="Times New Roman"/>
                 <w:color w:val="1E1E1E"/>
-                <w:sz w:val="19"/>
+                <w:sz w:val="20"/>
               </w:rPr>
               <w:t>5</w:t>
             </w:r>
@@ -979,9 +1241,9 @@
               <w:rPr>
                 <w:rFonts w:ascii="Times New Roman" w:hAnsi="Times New Roman"/>
                 <w:color w:val="1E1E1E"/>
-                <w:sz w:val="19"/>
+                <w:sz w:val="20"/>
               </w:rPr>
-              <w:t>Tổ chức cấu trúc dự án chuẩn modular (Docs, Database, Sample_Data, Backend, Frontend). Khởi tạo Git repository, cấu hình .gitignore và đẩy toàn bộ lên GitHub.</w:t>
+              <w:t>Tổ chức cấu trúc dự án chuẩn modular (Docs, Database, Sample_Data, Backend, Frontend). Khởi tạo Git repository và đẩy lên GitHub.</w:t>
             </w:r>
           </w:p>
         </w:tc>
@@ -998,13 +1260,13 @@
           </w:tcPr>
           <w:p>
             <w:pPr>
-              <w:jc w:val="center"/>
+              <w:jc w:val="left"/>
             </w:pPr>
             <w:r>
               <w:rPr>
                 <w:rFonts w:ascii="Times New Roman" w:hAnsi="Times New Roman"/>
                 <w:color w:val="1E1E1E"/>
-                <w:sz w:val="19"/>
+                <w:sz w:val="20"/>
               </w:rPr>
               <w:t>Đỗ Tấn Du</w:t>
             </w:r>
@@ -1029,7 +1291,7 @@
               <w:rPr>
                 <w:rFonts w:ascii="Times New Roman" w:hAnsi="Times New Roman"/>
                 <w:color w:val="1E1E1E"/>
-                <w:sz w:val="19"/>
+                <w:sz w:val="20"/>
               </w:rPr>
               <w:t>Repo GitHub hoạt động: https://github.com/DoTanDu/supply-chain-spoilage-predictor</w:t>
             </w:r>
@@ -1054,7 +1316,7 @@
               <w:rPr>
                 <w:rFonts w:ascii="Times New Roman" w:hAnsi="Times New Roman"/>
                 <w:color w:val="1E1E1E"/>
-                <w:sz w:val="19"/>
+                <w:sz w:val="20"/>
               </w:rPr>
               <w:t>100%</w:t>
             </w:r>
@@ -1065,197 +1327,555 @@
     <w:p>
       <w:pPr>
         <w:keepNext/>
-        <w:spacing w:before="240" w:after="80"/>
+        <w:spacing w:before="200" w:after="60"/>
       </w:pPr>
       <w:r>
         <w:rPr>
           <w:rFonts w:ascii="Times New Roman" w:hAnsi="Times New Roman"/>
           <w:b/>
-          <w:color w:val="1F497D"/>
-          <w:sz w:val="25"/>
+          <w:color w:val="000000"/>
+          <w:sz w:val="26"/>
         </w:rPr>
-        <w:t>3. Khó khăn kỹ thuật gặp phải và giải pháp xử lý</w:t>
+        <w:t>6.  Khó khăn, vướng mắc và giải pháp xử lý</w:t>
       </w:r>
+    </w:p>
+    <w:tbl>
+      <w:tblPr>
+        <w:tblW w:type="auto" w:w="0"/>
+        <w:jc w:val="center"/>
+        <w:tblLayout w:type="fixed"/>
+        <w:tblLook w:firstColumn="1" w:firstRow="1" w:lastColumn="0" w:lastRow="0" w:noHBand="0" w:noVBand="1" w:val="04A0"/>
+        <w:tblBorders>
+          <w:top w:val="single" w:sz="6" w:space="0" w:color="B0B0B0"/>
+          <w:bottom w:val="single" w:sz="6" w:space="0" w:color="B0B0B0"/>
+          <w:left w:val="single" w:sz="6" w:space="0" w:color="B0B0B0"/>
+          <w:right w:val="single" w:sz="6" w:space="0" w:color="B0B0B0"/>
+          <w:insideH w:val="single" w:sz="6" w:space="0" w:color="B0B0B0"/>
+          <w:insideV w:val="single" w:sz="6" w:space="0" w:color="B0B0B0"/>
+        </w:tblBorders>
+      </w:tblPr>
+      <w:tblGrid>
+        <w:gridCol w:w="9662"/>
+      </w:tblGrid>
+      <w:tr>
+        <w:tc>
+          <w:tcPr>
+            <w:tcW w:type="dxa" w:w="9648"/>
+            <w:shd w:fill="FAFAFA"/>
+            <w:tcMar>
+              <w:top w:w="100" w:type="dxa"/>
+              <w:bottom w:w="100" w:type="dxa"/>
+              <w:left w:w="140" w:type="dxa"/>
+              <w:right w:w="140" w:type="dxa"/>
+            </w:tcMar>
+          </w:tcPr>
+          <w:p>
+            <w:pPr>
+              <w:spacing w:after="60" w:before="0" w:line="276" w:lineRule="auto"/>
+            </w:pPr>
+            <w:r>
+              <w:rPr>
+                <w:rFonts w:ascii="Times New Roman" w:hAnsi="Times New Roman"/>
+                <w:b/>
+                <w:i w:val="0"/>
+                <w:sz w:val="22"/>
+              </w:rPr>
+              <w:t xml:space="preserve">Lệch bảng mã Tiếng Việt trên SQL Server: </w:t>
+            </w:r>
+            <w:r>
+              <w:rPr>
+                <w:rFonts w:ascii="Times New Roman" w:hAnsi="Times New Roman"/>
+                <w:sz w:val="22"/>
+              </w:rPr>
+              <w:t>Khi nạp ban đầu bị lỗi hiển thị font dấu tiếng Việt trong SSMS. Nhóm đã xử lý triệt để bằng cách chuyển mã nguồn T-SQL sang UTF-8 with BOM (utf-8-sig) và khai báo tiền tố N'...' cho toàn bộ chuỗi Unicode.</w:t>
+            </w:r>
+          </w:p>
+          <w:p>
+            <w:pPr>
+              <w:spacing w:after="60" w:before="0" w:line="276" w:lineRule="auto"/>
+            </w:pPr>
+            <w:r>
+              <w:rPr>
+                <w:rFonts w:ascii="Times New Roman" w:hAnsi="Times New Roman"/>
+                <w:b/>
+                <w:i w:val="0"/>
+                <w:sz w:val="22"/>
+              </w:rPr>
+              <w:t xml:space="preserve">Cấu hình dịch vụ máy chủ SQL Server: </w:t>
+            </w:r>
+            <w:r>
+              <w:rPr>
+                <w:rFonts w:ascii="Times New Roman" w:hAnsi="Times New Roman"/>
+                <w:sz w:val="22"/>
+              </w:rPr>
+              <w:t>Dịch vụ MSSQL$SQLEXPRESS bị lỗi đường dẫn tệp hệ thống trên máy local. Nhóm đã chuyển hướng cấu hình kết nối trực tiếp vào Microsoft SQL Server LocalDB ((localdb)\mssqllocaldb) sẵn có, đảm bảo cả 2 thành viên đều thao tác thuận tiện trên SSMS.</w:t>
+            </w:r>
+          </w:p>
+          <w:p>
+            <w:pPr>
+              <w:spacing w:after="60" w:before="0" w:line="276" w:lineRule="auto"/>
+            </w:pPr>
+            <w:r>
+              <w:rPr>
+                <w:rFonts w:ascii="Times New Roman" w:hAnsi="Times New Roman"/>
+                <w:b/>
+                <w:i w:val="0"/>
+                <w:sz w:val="22"/>
+              </w:rPr>
+              <w:t xml:space="preserve">Đồng bộ môi trường làm việc nhóm: </w:t>
+            </w:r>
+            <w:r>
+              <w:rPr>
+                <w:rFonts w:ascii="Times New Roman" w:hAnsi="Times New Roman"/>
+                <w:sz w:val="22"/>
+              </w:rPr>
+              <w:t>Để đảm bảo bạn Quân tải về máy là chạy được ngay, nhóm đã đóng gói tài liệu HUONG_DAN_DATABASE.md chi tiết từng bước kết nối SSMS và chia sẻ quyền cộng tác trên GitHub.</w:t>
+            </w:r>
+          </w:p>
+        </w:tc>
+      </w:tr>
+    </w:tbl>
+    <w:p>
+      <w:pPr>
+        <w:spacing w:after="80" w:before="0"/>
+      </w:pPr>
     </w:p>
     <w:p>
       <w:pPr>
-        <w:pStyle w:val="ListBullet"/>
-        <w:spacing w:after="40" w:line="276" w:lineRule="auto"/>
+        <w:keepNext/>
+        <w:spacing w:before="200" w:after="60"/>
       </w:pPr>
       <w:r>
         <w:rPr>
           <w:rFonts w:ascii="Times New Roman" w:hAnsi="Times New Roman"/>
           <w:b/>
-          <w:sz w:val="21"/>
+          <w:color w:val="000000"/>
+          <w:sz w:val="26"/>
         </w:rPr>
-        <w:t xml:space="preserve">Lệch bảng mã Tiếng Việt trên SQL Server: </w:t>
+        <w:t>7.  Kế hoạch thực hiện tuần tiếp theo (21/09/2026 – 27/09/2026)</w:t>
       </w:r>
-      <w:r>
-        <w:rPr>
-          <w:rFonts w:ascii="Times New Roman" w:hAnsi="Times New Roman"/>
-          <w:sz w:val="21"/>
-        </w:rPr>
-        <w:t>Khi nạp ban đầu bị lỗi hiển thị font dấu tiếng Việt trong SSMS. Nhóm đã xử lý triệt để bằng cách chuyển mã nguồn T-SQL sang UTF-8 with BOM (utf-8-sig) và khai báo tiền tố N'...' cho toàn bộ chuỗi ký tự Unicode.</w:t>
-      </w:r>
+    </w:p>
+    <w:tbl>
+      <w:tblPr>
+        <w:tblW w:type="auto" w:w="0"/>
+        <w:jc w:val="center"/>
+        <w:tblLayout w:type="fixed"/>
+        <w:tblLook w:firstColumn="1" w:firstRow="1" w:lastColumn="0" w:lastRow="0" w:noHBand="0" w:noVBand="1" w:val="04A0"/>
+        <w:tblBorders>
+          <w:top w:val="single" w:sz="6" w:space="0" w:color="B0B0B0"/>
+          <w:bottom w:val="single" w:sz="6" w:space="0" w:color="B0B0B0"/>
+          <w:left w:val="single" w:sz="6" w:space="0" w:color="B0B0B0"/>
+          <w:right w:val="single" w:sz="6" w:space="0" w:color="B0B0B0"/>
+          <w:insideH w:val="single" w:sz="6" w:space="0" w:color="B0B0B0"/>
+          <w:insideV w:val="single" w:sz="6" w:space="0" w:color="B0B0B0"/>
+        </w:tblBorders>
+      </w:tblPr>
+      <w:tblGrid>
+        <w:gridCol w:w="9662"/>
+      </w:tblGrid>
+      <w:tr>
+        <w:tc>
+          <w:tcPr>
+            <w:tcW w:type="dxa" w:w="9648"/>
+            <w:shd w:fill="FAFAFA"/>
+            <w:tcMar>
+              <w:top w:w="100" w:type="dxa"/>
+              <w:bottom w:w="100" w:type="dxa"/>
+              <w:left w:w="140" w:type="dxa"/>
+              <w:right w:w="140" w:type="dxa"/>
+            </w:tcMar>
+          </w:tcPr>
+          <w:p>
+            <w:pPr>
+              <w:spacing w:after="60" w:before="0" w:line="276" w:lineRule="auto"/>
+            </w:pPr>
+            <w:r>
+              <w:rPr>
+                <w:rFonts w:ascii="Times New Roman" w:hAnsi="Times New Roman"/>
+                <w:sz w:val="22"/>
+              </w:rPr>
+              <w:t>Theo đúng Kế hoạch thực hiện (bắt đầu giai đoạn STT 6 &amp; 7 từ 21/09 đến 18/10), nhóm phân công:</w:t>
+            </w:r>
+          </w:p>
+          <w:p>
+            <w:pPr>
+              <w:spacing w:after="60" w:before="0" w:line="276" w:lineRule="auto"/>
+            </w:pPr>
+            <w:r>
+              <w:rPr>
+                <w:rFonts w:ascii="Times New Roman" w:hAnsi="Times New Roman"/>
+                <w:b w:val="0"/>
+                <w:i w:val="0"/>
+                <w:sz w:val="22"/>
+              </w:rPr>
+              <w:t xml:space="preserve">- </w:t>
+            </w:r>
+            <w:r>
+              <w:rPr>
+                <w:rFonts w:ascii="Times New Roman" w:hAnsi="Times New Roman"/>
+                <w:b/>
+                <w:i w:val="0"/>
+                <w:sz w:val="22"/>
+              </w:rPr>
+              <w:t xml:space="preserve">Đỗ Tấn Du (Frontend): </w:t>
+            </w:r>
+            <w:r>
+              <w:rPr>
+                <w:rFonts w:ascii="Times New Roman" w:hAnsi="Times New Roman"/>
+                <w:sz w:val="22"/>
+              </w:rPr>
+              <w:t>Khởi tạo dự án React (Vite) + TailwindCSS trong thư mục Frontend/; xây dựng Layout Dashboard tổng thể (Sidebar, Header, Alert Badge); dựng màn hình Quản lý Lô hàng &amp; Bảng cảnh báo hạn sử dụng (FEFO).</w:t>
+            </w:r>
+          </w:p>
+          <w:p>
+            <w:pPr>
+              <w:spacing w:after="60" w:before="0" w:line="276" w:lineRule="auto"/>
+            </w:pPr>
+            <w:r>
+              <w:rPr>
+                <w:rFonts w:ascii="Times New Roman" w:hAnsi="Times New Roman"/>
+                <w:b w:val="0"/>
+                <w:i w:val="0"/>
+                <w:sz w:val="22"/>
+              </w:rPr>
+              <w:t xml:space="preserve">- </w:t>
+            </w:r>
+            <w:r>
+              <w:rPr>
+                <w:rFonts w:ascii="Times New Roman" w:hAnsi="Times New Roman"/>
+                <w:b/>
+                <w:i w:val="0"/>
+                <w:sz w:val="22"/>
+              </w:rPr>
+              <w:t xml:space="preserve">Đoàn Minh Quân (Backend): </w:t>
+            </w:r>
+            <w:r>
+              <w:rPr>
+                <w:rFonts w:ascii="Times New Roman" w:hAnsi="Times New Roman"/>
+                <w:sz w:val="22"/>
+              </w:rPr>
+              <w:t>Khởi tạo dự án Backend API trong thư mục Backend/; cấu hình kết nối CSDL SQL Server LocalDB; viết các RESTful API xác thực người dùng (JWT) và API danh mục sản phẩm, nhập lô hàng.</w:t>
+            </w:r>
+          </w:p>
+        </w:tc>
+      </w:tr>
+    </w:tbl>
+    <w:p>
+      <w:pPr>
+        <w:spacing w:after="80" w:before="0"/>
+      </w:pPr>
     </w:p>
     <w:p>
       <w:pPr>
-        <w:pStyle w:val="ListBullet"/>
-        <w:spacing w:after="40" w:line="276" w:lineRule="auto"/>
+        <w:keepNext/>
+        <w:spacing w:before="200" w:after="60"/>
       </w:pPr>
       <w:r>
         <w:rPr>
           <w:rFonts w:ascii="Times New Roman" w:hAnsi="Times New Roman"/>
           <w:b/>
-          <w:sz w:val="21"/>
+          <w:color w:val="000000"/>
+          <w:sz w:val="26"/>
         </w:rPr>
-        <w:t xml:space="preserve">Cấu hình dịch vụ máy chủ SQL Server: </w:t>
+        <w:t>8.  Đánh giá và xác nhận của các bên</w:t>
       </w:r>
-      <w:r>
-        <w:rPr>
-          <w:rFonts w:ascii="Times New Roman" w:hAnsi="Times New Roman"/>
-          <w:sz w:val="21"/>
-        </w:rPr>
-        <w:t>Dịch vụ MSSQL$SQLEXPRESS bị lỗi đường dẫn tệp hệ thống trên máy local. Nhóm đã chuyển hướng cấu hình kết nối trực tiếp vào Microsoft SQL Server LocalDB ((localdb)\mssqllocaldb) sẵn có, đảm bảo cả 2 thành viên đều thao tác thuận tiện trên SSMS.</w:t>
-      </w:r>
+    </w:p>
+    <w:tbl>
+      <w:tblPr>
+        <w:tblW w:type="auto" w:w="0"/>
+        <w:jc w:val="center"/>
+        <w:tblLayout w:type="fixed"/>
+        <w:tblLook w:firstColumn="1" w:firstRow="1" w:lastColumn="0" w:lastRow="0" w:noHBand="0" w:noVBand="1" w:val="04A0"/>
+        <w:tblBorders>
+          <w:top w:val="single" w:sz="6" w:space="0" w:color="B0B0B0"/>
+          <w:bottom w:val="single" w:sz="6" w:space="0" w:color="B0B0B0"/>
+          <w:left w:val="single" w:sz="6" w:space="0" w:color="B0B0B0"/>
+          <w:right w:val="single" w:sz="6" w:space="0" w:color="B0B0B0"/>
+          <w:insideH w:val="single" w:sz="6" w:space="0" w:color="B0B0B0"/>
+          <w:insideV w:val="single" w:sz="6" w:space="0" w:color="B0B0B0"/>
+        </w:tblBorders>
+      </w:tblPr>
+      <w:tblGrid>
+        <w:gridCol w:w="9662"/>
+      </w:tblGrid>
+      <w:tr>
+        <w:tc>
+          <w:tcPr>
+            <w:tcW w:type="dxa" w:w="9648"/>
+            <w:shd w:fill="FAFAFA"/>
+            <w:tcMar>
+              <w:top w:w="100" w:type="dxa"/>
+              <w:bottom w:w="100" w:type="dxa"/>
+              <w:left w:w="140" w:type="dxa"/>
+              <w:right w:w="140" w:type="dxa"/>
+            </w:tcMar>
+          </w:tcPr>
+          <w:p>
+            <w:pPr>
+              <w:spacing w:after="60" w:before="0" w:line="276" w:lineRule="auto"/>
+            </w:pPr>
+            <w:r>
+              <w:rPr>
+                <w:rFonts w:ascii="Times New Roman" w:hAnsi="Times New Roman"/>
+                <w:b/>
+                <w:i w:val="0"/>
+                <w:sz w:val="22"/>
+              </w:rPr>
+              <w:t xml:space="preserve">Tự đánh giá tiến độ: </w:t>
+            </w:r>
+            <w:r>
+              <w:rPr>
+                <w:rFonts w:ascii="Times New Roman" w:hAnsi="Times New Roman"/>
+                <w:sz w:val="22"/>
+              </w:rPr>
+              <w:t>Tiến độ đạt 100% mục tiêu giai đoạn Thiết kế &amp; Khảo sát (STT 4 &amp; 5 trong bảng Kế hoạch đề tài). Toàn bộ nền tảng nghiệp vụ, tài liệu học thuật, sơ đồ hệ thống và Cơ sở dữ liệu đã hoàn tất, sẵn sàng 100% bước vào giai đoạn lập trình mã nguồn.</w:t>
+            </w:r>
+          </w:p>
+        </w:tc>
+      </w:tr>
+    </w:tbl>
+    <w:p>
+      <w:pPr>
+        <w:spacing w:after="80" w:before="0"/>
+      </w:pPr>
     </w:p>
     <w:p>
       <w:pPr>
-        <w:pStyle w:val="ListBullet"/>
-        <w:spacing w:after="40" w:line="276" w:lineRule="auto"/>
-      </w:pPr>
-      <w:r>
-        <w:rPr>
-          <w:rFonts w:ascii="Times New Roman" w:hAnsi="Times New Roman"/>
-          <w:b/>
-          <w:sz w:val="21"/>
-        </w:rPr>
-        <w:t xml:space="preserve">Đồng bộ môi trường làm việc nhóm: </w:t>
-      </w:r>
-      <w:r>
-        <w:rPr>
-          <w:rFonts w:ascii="Times New Roman" w:hAnsi="Times New Roman"/>
-          <w:sz w:val="21"/>
-        </w:rPr>
-        <w:t>Để đảm bảo Quân tải về máy là chạy được ngay, nhóm đã đóng gói tài liệu HUONG_DAN_DATABASE.md chi tiết từng bước kết nối SSMS và chia sẻ quyền cộng tác trên GitHub.</w:t>
-      </w:r>
-    </w:p>
-    <w:p>
-      <w:pPr>
-        <w:keepNext/>
-        <w:spacing w:before="240" w:after="80"/>
-      </w:pPr>
-      <w:r>
-        <w:rPr>
-          <w:rFonts w:ascii="Times New Roman" w:hAnsi="Times New Roman"/>
-          <w:b/>
-          <w:color w:val="1F497D"/>
-          <w:sz w:val="25"/>
-        </w:rPr>
-        <w:t>4. Kế hoạch tuần tiếp theo (21/09/2026 – 27/09/2026)</w:t>
-      </w:r>
-    </w:p>
-    <w:p>
-      <w:pPr>
-        <w:spacing w:after="60" w:line="276" w:lineRule="auto"/>
-      </w:pPr>
-      <w:r>
-        <w:rPr>
-          <w:rFonts w:ascii="Times New Roman" w:hAnsi="Times New Roman"/>
-          <w:sz w:val="21"/>
-        </w:rPr>
-        <w:t>Theo đúng tiến độ Kế hoạch thực hiện (bắt đầu giai đoạn STT 6 &amp; 7 từ 21/09 đến 18/10), nhóm phân công:</w:t>
-      </w:r>
-    </w:p>
-    <w:p>
-      <w:pPr>
-        <w:pStyle w:val="ListBullet"/>
-        <w:spacing w:after="40" w:line="276" w:lineRule="auto"/>
-      </w:pPr>
-      <w:r>
-        <w:rPr>
-          <w:rFonts w:ascii="Times New Roman" w:hAnsi="Times New Roman"/>
-          <w:b/>
-          <w:sz w:val="21"/>
-        </w:rPr>
-        <w:t xml:space="preserve">Đỗ Tấn Du (Frontend): </w:t>
-      </w:r>
-      <w:r>
-        <w:rPr>
-          <w:rFonts w:ascii="Times New Roman" w:hAnsi="Times New Roman"/>
-          <w:sz w:val="21"/>
-        </w:rPr>
-        <w:t>Khởi tạo dự án React (Vite) + TailwindCSS trong thư mục Frontend/; xây dựng Layout Dashboard tổng thể (Sidebar, Header, Alert Badge); dựng màn hình Quản lý Lô hàng &amp; Bảng cảnh báo hạn sử dụng (FEFO).</w:t>
-      </w:r>
-    </w:p>
-    <w:p>
-      <w:pPr>
-        <w:pStyle w:val="ListBullet"/>
-        <w:spacing w:after="40" w:line="276" w:lineRule="auto"/>
-      </w:pPr>
-      <w:r>
-        <w:rPr>
-          <w:rFonts w:ascii="Times New Roman" w:hAnsi="Times New Roman"/>
-          <w:b/>
-          <w:sz w:val="21"/>
-        </w:rPr>
-        <w:t xml:space="preserve">Đoàn Minh Quân (Backend): </w:t>
-      </w:r>
-      <w:r>
-        <w:rPr>
-          <w:rFonts w:ascii="Times New Roman" w:hAnsi="Times New Roman"/>
-          <w:sz w:val="21"/>
-        </w:rPr>
-        <w:t>Khởi tạo dự án Backend API trong thư mục Backend/; cấu hình kết nối CSDL SQL Server LocalDB; viết các RESTful API xác thực người dùng (JWT) và API danh mục sản phẩm, nhập lô hàng.</w:t>
-      </w:r>
-    </w:p>
-    <w:p>
-      <w:pPr>
-        <w:keepNext/>
-        <w:spacing w:before="240" w:after="80"/>
-      </w:pPr>
-      <w:r>
-        <w:rPr>
-          <w:rFonts w:ascii="Times New Roman" w:hAnsi="Times New Roman"/>
-          <w:b/>
-          <w:color w:val="1F497D"/>
-          <w:sz w:val="25"/>
-        </w:rPr>
-        <w:t>5. Tự đánh giá mức độ hoàn thành</w:t>
-      </w:r>
-    </w:p>
-    <w:p>
-      <w:pPr>
-        <w:spacing w:after="60" w:line="276" w:lineRule="auto"/>
-      </w:pPr>
-      <w:r>
-        <w:rPr>
-          <w:rFonts w:ascii="Times New Roman" w:hAnsi="Times New Roman"/>
-          <w:sz w:val="21"/>
-        </w:rPr>
-        <w:t>Tiến độ đạt 100% mục tiêu giai đoạn Thiết kế &amp; Khảo sát (STT 4 &amp; 5 trong bảng Kế hoạch thực hiện đề tài). Toàn bộ nền tảng nghiệp vụ, tài liệu học thuật, sơ đồ hệ thống và Cơ sở dữ liệu đã sẵn sàng để bước vào giai đoạn Lập trình Backend - Frontend.</w:t>
-      </w:r>
-    </w:p>
-    <w:p>
-      <w:pPr>
-        <w:spacing w:before="280"/>
+        <w:spacing w:before="280" w:after="80"/>
         <w:jc w:val="right"/>
       </w:pPr>
       <w:r>
         <w:rPr>
           <w:rFonts w:ascii="Times New Roman" w:hAnsi="Times New Roman"/>
-          <w:sz w:val="21"/>
+          <w:i/>
+          <w:sz w:val="22"/>
         </w:rPr>
         <w:t>Đồng Nai, Ngày 19 tháng 09 năm 2026</w:t>
-        <w:br/>
-        <w:t>Đại diện nhóm sinh viên thực hiện</w:t>
-        <w:br/>
-        <w:br/>
-        <w:br/>
-        <w:br/>
-        <w:t>Đỗ Tấn Du</w:t>
       </w:r>
     </w:p>
+    <w:tbl>
+      <w:tblPr>
+        <w:tblW w:type="auto" w:w="0"/>
+        <w:jc w:val="center"/>
+        <w:tblLayout w:type="fixed"/>
+        <w:tblLook w:firstColumn="1" w:firstRow="1" w:lastColumn="0" w:lastRow="0" w:noHBand="0" w:noVBand="1" w:val="04A0"/>
+        <w:tblBorders>
+          <w:top w:val="none" w:sz="0" w:space="0" w:color="auto"/>
+          <w:bottom w:val="none" w:sz="0" w:space="0" w:color="auto"/>
+          <w:left w:val="none" w:sz="0" w:space="0" w:color="auto"/>
+          <w:right w:val="none" w:sz="0" w:space="0" w:color="auto"/>
+          <w:insideH w:val="none" w:sz="0" w:space="0" w:color="auto"/>
+          <w:insideV w:val="none" w:sz="0" w:space="0" w:color="auto"/>
+        </w:tblBorders>
+      </w:tblPr>
+      <w:tblGrid>
+        <w:gridCol w:w="3221"/>
+        <w:gridCol w:w="3221"/>
+        <w:gridCol w:w="3221"/>
+      </w:tblGrid>
+      <w:tr>
+        <w:tc>
+          <w:tcPr>
+            <w:tcW w:type="dxa" w:w="3240"/>
+          </w:tcPr>
+          <w:p>
+            <w:pPr>
+              <w:spacing w:after="40"/>
+              <w:jc w:val="center"/>
+            </w:pPr>
+            <w:r>
+              <w:rPr>
+                <w:rFonts w:ascii="Times New Roman" w:hAnsi="Times New Roman"/>
+                <w:b/>
+                <w:i w:val="0"/>
+                <w:sz w:val="22"/>
+              </w:rPr>
+              <w:t>GIẢNG VIÊN HƯỚNG DẪN</w:t>
+            </w:r>
+            <w:r>
+              <w:rPr>
+                <w:rFonts w:ascii="Times New Roman" w:hAnsi="Times New Roman"/>
+                <w:b w:val="0"/>
+                <w:i/>
+                <w:sz w:val="22"/>
+              </w:rPr>
+              <w:br/>
+              <w:t>(Ký và ghi rõ họ tên)</w:t>
+            </w:r>
+          </w:p>
+        </w:tc>
+        <w:tc>
+          <w:tcPr>
+            <w:tcW w:type="dxa" w:w="3240"/>
+          </w:tcPr>
+          <w:p>
+            <w:pPr>
+              <w:spacing w:after="40"/>
+              <w:jc w:val="center"/>
+            </w:pPr>
+            <w:r>
+              <w:rPr>
+                <w:rFonts w:ascii="Times New Roman" w:hAnsi="Times New Roman"/>
+                <w:b/>
+                <w:i w:val="0"/>
+                <w:sz w:val="22"/>
+              </w:rPr>
+              <w:t>SINH VIÊN THỰC HIỆN</w:t>
+            </w:r>
+            <w:r>
+              <w:rPr>
+                <w:rFonts w:ascii="Times New Roman" w:hAnsi="Times New Roman"/>
+                <w:b w:val="0"/>
+                <w:i/>
+                <w:sz w:val="22"/>
+              </w:rPr>
+              <w:br/>
+              <w:t>(Ký và ghi rõ họ tên)</w:t>
+            </w:r>
+          </w:p>
+        </w:tc>
+        <w:tc>
+          <w:tcPr>
+            <w:tcW w:type="dxa" w:w="3168"/>
+          </w:tcPr>
+          <w:p>
+            <w:pPr>
+              <w:spacing w:after="40"/>
+              <w:jc w:val="center"/>
+            </w:pPr>
+            <w:r>
+              <w:rPr>
+                <w:rFonts w:ascii="Times New Roman" w:hAnsi="Times New Roman"/>
+                <w:b/>
+                <w:i w:val="0"/>
+                <w:sz w:val="22"/>
+              </w:rPr>
+              <w:t>SINH VIÊN THỰC HIỆN</w:t>
+            </w:r>
+            <w:r>
+              <w:rPr>
+                <w:rFonts w:ascii="Times New Roman" w:hAnsi="Times New Roman"/>
+                <w:b w:val="0"/>
+                <w:i/>
+                <w:sz w:val="22"/>
+              </w:rPr>
+              <w:br/>
+              <w:t>(Ký và ghi rõ họ tên)</w:t>
+            </w:r>
+          </w:p>
+        </w:tc>
+      </w:tr>
+      <w:tr>
+        <w:tc>
+          <w:tcPr>
+            <w:tcW w:type="dxa" w:w="3240"/>
+          </w:tcPr>
+          <w:p>
+            <w:pPr>
+              <w:spacing w:before="0" w:after="120"/>
+              <w:jc w:val="center"/>
+            </w:pPr>
+            <w:r>
+              <w:rPr>
+                <w:rFonts w:ascii="Times New Roman" w:hAnsi="Times New Roman"/>
+                <w:b w:val="0"/>
+                <w:sz w:val="22"/>
+              </w:rPr>
+              <w:br/>
+              <w:br/>
+              <w:br/>
+              <w:br/>
+            </w:r>
+            <w:r>
+              <w:rPr>
+                <w:rFonts w:ascii="Times New Roman" w:hAnsi="Times New Roman"/>
+                <w:b/>
+                <w:sz w:val="22"/>
+              </w:rPr>
+              <w:t>ThS. Lê Minh Nhật</w:t>
+            </w:r>
+          </w:p>
+        </w:tc>
+        <w:tc>
+          <w:tcPr>
+            <w:tcW w:type="dxa" w:w="3240"/>
+          </w:tcPr>
+          <w:p>
+            <w:pPr>
+              <w:spacing w:before="0" w:after="120"/>
+              <w:jc w:val="center"/>
+            </w:pPr>
+            <w:r>
+              <w:rPr>
+                <w:rFonts w:ascii="Times New Roman" w:hAnsi="Times New Roman"/>
+                <w:b w:val="0"/>
+                <w:sz w:val="22"/>
+              </w:rPr>
+              <w:br/>
+              <w:br/>
+              <w:br/>
+              <w:br/>
+            </w:r>
+            <w:r>
+              <w:rPr>
+                <w:rFonts w:ascii="Times New Roman" w:hAnsi="Times New Roman"/>
+                <w:b/>
+                <w:sz w:val="22"/>
+              </w:rPr>
+              <w:t>Đỗ Tấn Du</w:t>
+            </w:r>
+            <w:r>
+              <w:rPr>
+                <w:rFonts w:ascii="Times New Roman" w:hAnsi="Times New Roman"/>
+                <w:b w:val="0"/>
+                <w:sz w:val="22"/>
+              </w:rPr>
+              <w:br/>
+              <w:t>MSSV: 123001364</w:t>
+            </w:r>
+          </w:p>
+        </w:tc>
+        <w:tc>
+          <w:tcPr>
+            <w:tcW w:type="dxa" w:w="3168"/>
+          </w:tcPr>
+          <w:p>
+            <w:pPr>
+              <w:spacing w:before="0" w:after="120"/>
+              <w:jc w:val="center"/>
+            </w:pPr>
+            <w:r>
+              <w:rPr>
+                <w:rFonts w:ascii="Times New Roman" w:hAnsi="Times New Roman"/>
+                <w:b w:val="0"/>
+                <w:sz w:val="22"/>
+              </w:rPr>
+              <w:br/>
+              <w:br/>
+              <w:br/>
+              <w:br/>
+            </w:r>
+            <w:r>
+              <w:rPr>
+                <w:rFonts w:ascii="Times New Roman" w:hAnsi="Times New Roman"/>
+                <w:b/>
+                <w:sz w:val="22"/>
+              </w:rPr>
+              <w:t>Đoàn Minh Quân</w:t>
+            </w:r>
+            <w:r>
+              <w:rPr>
+                <w:rFonts w:ascii="Times New Roman" w:hAnsi="Times New Roman"/>
+                <w:b w:val="0"/>
+                <w:sz w:val="22"/>
+              </w:rPr>
+              <w:br/>
+              <w:t>MSSV: 123000946</w:t>
+            </w:r>
+          </w:p>
+        </w:tc>
+      </w:tr>
+    </w:tbl>
     <w:sectPr>
       <w:pgSz w:w="12240" w:h="15840"/>
       <w:pgMar w:top="1138" w:right="1138" w:bottom="1138" w:left="1440" w:header="720" w:footer="720" w:gutter="0"/>

</xml_diff>